<commit_message>
Update site (2026-07-14 14:45)
</commit_message>
<xml_diff>
--- a/Letter to Chief Provincial Psychiatrist - Form 4 PDF validity.docx
+++ b/Letter to Chief Provincial Psychiatrist - Form 4 PDF validity.docx
@@ -219,6 +219,22 @@
           <w:szCs w:val="22"/>
         </w:rPr>
         <w:t xml:space="preserve">The PDF published on the Manitoba Laws website reproduces the form prescribed under the Mental Health Forms Regulation, Man. Reg. 145/99. A legibly completed and signed printout is identical in substance to the same form supplied in pre-printed format. Section 37 of The Interpretation Act (C.C.S.M. c. I80) provides that a form that differs from the prescribed form may be validly used if the differences do not affect the substance and are not likely to mislead; a faithful printout of the prescribed form itself raises no such concern. The existing emergency exception already accepts a printed Form 4 in the most consequential circumstances, which we would suggest demonstrates that the printed PDF is fit for purpose in all circumstances.</w:t>
+      </w:r>
+    </w:p>
+    <w:p>
+      <w:pPr>
+        <w:spacing w:after="200" w:line="276"/>
+        <w:jc w:val="left"/>
+      </w:pPr>
+      <w:r>
+        <w:rPr>
+          <w:rFonts w:ascii="Arial" w:cs="Arial" w:eastAsia="Arial" w:hAnsi="Arial"/>
+          <w:b w:val="false"/>
+          <w:bCs w:val="false"/>
+          <w:sz w:val="22"/>
+          <w:szCs w:val="22"/>
+        </w:rPr>
+        <w:t xml:space="preserve">Recognizing the published PDF would also address an accessibility concern. A form that is valid only in pre-printed format must be completed by hand. Physicians with disabilities affecting handwriting — tremor, arthritis, or visual impairment, among others — can complete a fillable PDF by typing or with assistive technology, but may be unable to complete a pre-printed form legibly or at all. Permitting typed completion of the published form would remove an unnecessary barrier for these colleagues, consistent with the duty to accommodate, and would improve legibility for everyone who must subsequently read and act on the form.</w:t>
       </w:r>
     </w:p>
     <w:p>

</xml_diff>